<commit_message>
dfr_kldist -> PSI; dfr_aedd new criteria psi
</commit_message>
<xml_diff>
--- a/examples/2_online_prediction/doc/dfr_adwin.docx
+++ b/examples/2_online_prediction/doc/dfr_adwin.docx
@@ -3978,7 +3978,7 @@
         <w:rPr>
           <w:rStyle w:val="VerbatimChar"/>
         </w:rPr>
-        <w:t xml:space="preserve">## 1           2  0  0  0  0       0 0.0006356239</w:t>
+        <w:t xml:space="preserve">## 1           2  0  0  0  0       0 0.0006561279</w:t>
       </w:r>
       <w:r>
         <w:br/>
@@ -3987,7 +3987,7 @@
         <w:rPr>
           <w:rStyle w:val="VerbatimChar"/>
         </w:rPr>
-        <w:t xml:space="preserve">## 2           3 33  0 17  0       0 0.0138001442</w:t>
+        <w:t xml:space="preserve">## 2           3 33  0 17  0       0 0.0148470402</w:t>
       </w:r>
       <w:r>
         <w:br/>
@@ -3996,7 +3996,7 @@
         <w:rPr>
           <w:rStyle w:val="VerbatimChar"/>
         </w:rPr>
-        <w:t xml:space="preserve">## 3           4 27  0 23  0       0 0.0064923763</w:t>
+        <w:t xml:space="preserve">## 3           4 27  0 23  0       0 0.0063805580</w:t>
       </w:r>
       <w:r>
         <w:br/>
@@ -4005,7 +4005,7 @@
         <w:rPr>
           <w:rStyle w:val="VerbatimChar"/>
         </w:rPr>
-        <w:t xml:space="preserve">## 4           5 26  0 23  1       0 0.0065772533</w:t>
+        <w:t xml:space="preserve">## 4           5 26  0 23  1       0 0.0066699982</w:t>
       </w:r>
       <w:r>
         <w:br/>
@@ -4014,7 +4014,7 @@
         <w:rPr>
           <w:rStyle w:val="VerbatimChar"/>
         </w:rPr>
-        <w:t xml:space="preserve">## 5           6  0  0 23 27       0 0.0174853802</w:t>
+        <w:t xml:space="preserve">## 5           6  0  0 23 27       0 0.0061483383</w:t>
       </w:r>
       <w:r>
         <w:br/>
@@ -4023,7 +4023,7 @@
         <w:rPr>
           <w:rStyle w:val="VerbatimChar"/>
         </w:rPr>
-        <w:t xml:space="preserve">## 6           7  0  0  0  0       1 0.0117397308</w:t>
+        <w:t xml:space="preserve">## 6           7  0  0  0  0       1 0.0131444931</w:t>
       </w:r>
       <w:r>
         <w:br/>
@@ -4032,7 +4032,7 @@
         <w:rPr>
           <w:rStyle w:val="VerbatimChar"/>
         </w:rPr>
-        <w:t xml:space="preserve">## 7           8 24  1 25  0       0 0.0138638020</w:t>
+        <w:t xml:space="preserve">## 7           8 24  1 25  0       0 0.0134522915</w:t>
       </w:r>
       <w:r>
         <w:br/>
@@ -4041,7 +4041,7 @@
         <w:rPr>
           <w:rStyle w:val="VerbatimChar"/>
         </w:rPr>
-        <w:t xml:space="preserve">## 8           9 19  0 31  0       0 0.0062124729</w:t>
+        <w:t xml:space="preserve">## 8           9 19  0 31  0       0 0.0060446262</w:t>
       </w:r>
       <w:r>
         <w:br/>
@@ -4050,7 +4050,7 @@
         <w:rPr>
           <w:rStyle w:val="VerbatimChar"/>
         </w:rPr>
-        <w:t xml:space="preserve">## 9          10 25  0 25  0       0 0.0072219372</w:t>
+        <w:t xml:space="preserve">## 9          10 25  0 25  0       0 0.0064613819</w:t>
       </w:r>
     </w:p>
     <w:p>

</xml_diff>